<commit_message>
Regenerate all outputs from the merged pipeline
The four integrated branches changed code without regenerating figures, so
the committed outputs were stale against the merged tree. Full Run_All.R +
Compose_Figure_Panels.R run, both clean.

Also drops the logMME composite's orphaned files: mme-panel-into-roe stopped
producing Composite_Fig1 and moved its NRS panel onto the logROE figure, so
those PNG/TIFF/DOCX were left behind on disk. A stray tracked Word lock file
(~$mposite_Fig1_...docx) goes with them.

Known issue, untouched: the overlay figures clip their axis title and legend
at the device edge. That comes from fix-config-caching's longer group names
and larger strip text, and went unnoticed because that branch never
regenerated figures to look at.

Co-Authored-By: Claude Opus 5 <noreply@anthropic.com>
</commit_message>
<xml_diff>
--- a/New_Outputs/composites/stats_corner/Composite_Fig2_logROE_vs_outcomes.docx
+++ b/New_Outputs/composites/stats_corner/Composite_Fig2_logROE_vs_outcomes.docx
@@ -10,7 +10,7 @@
         <w:rPr/>
         <w:drawing>
           <wp:inline distT="0" distB="0" distL="0" distR="0">
-            <wp:extent cx="5943600" cy="3890033"/>
+            <wp:extent cx="5943600" cy="5781664"/>
             <wp:docPr id="1" name="" descr=""/>
             <wp:cNvGraphicFramePr>
               <a:graphicFrameLocks xmlns:a="http://schemas.openxmlformats.org/drawingml/2006/main" noChangeAspect="1"/>
@@ -33,7 +33,7 @@
                   <pic:spPr bwMode="auto">
                     <a:xfrm>
                       <a:off x="0" y="0"/>
-                      <a:ext cx="5943600" cy="3890033"/>
+                      <a:ext cx="5943600" cy="5781664"/>
                     </a:xfrm>
                     <a:prstGeom prst="rect">
                       <a:avLst/>

</xml_diff>